<commit_message>
feat: setup 3 columns and auto notes in checklist generation
</commit_message>
<xml_diff>
--- a/src/templates/registrasi/template_checklist.docx
+++ b/src/templates/registrasi/template_checklist.docx
@@ -195,25 +195,7 @@
                 <w:sz w:val="20"/>
                 <w:szCs w:val="20"/>
               </w:rPr>
-              <w:t>Telepon (0271) 891136, Faksimile (0271) 891136, Laman www.dlh.sragenkab.go.id, Pos-</w:t>
-            </w:r>
-            <w:proofErr w:type="spellStart"/>
-            <w:r>
-              <w:rPr>
-                <w:rFonts w:ascii="Arial Narrow" w:hAnsi="Arial Narrow" w:cs="Arial"/>
-                <w:sz w:val="20"/>
-                <w:szCs w:val="20"/>
-              </w:rPr>
-              <w:t>el</w:t>
-            </w:r>
-            <w:proofErr w:type="spellEnd"/>
-            <w:r>
-              <w:rPr>
-                <w:rFonts w:ascii="Arial Narrow" w:hAnsi="Arial Narrow" w:cs="Arial"/>
-                <w:sz w:val="20"/>
-                <w:szCs w:val="20"/>
-              </w:rPr>
-              <w:t xml:space="preserve"> dlh.sragenkab.go.id</w:t>
+              <w:t>Telepon (0271) 891136, Faksimile (0271) 891136, Laman www.dlh.sragenkab.go.id, Pos-el dlh.sragenkab.go.id</w:t>
             </w:r>
           </w:p>
         </w:tc>
@@ -346,21 +328,7 @@
               <w:rPr>
                 <w:rFonts w:ascii="Arial" w:hAnsi="Arial" w:cs="Arial"/>
               </w:rPr>
-              <w:t>{</w:t>
-            </w:r>
-            <w:proofErr w:type="spellStart"/>
-            <w:r>
-              <w:rPr>
-                <w:rFonts w:ascii="Arial" w:hAnsi="Arial" w:cs="Arial"/>
-              </w:rPr>
-              <w:t>nama_kegiatan</w:t>
-            </w:r>
-            <w:proofErr w:type="spellEnd"/>
-            <w:r>
-              <w:rPr>
-                <w:rFonts w:ascii="Arial" w:hAnsi="Arial" w:cs="Arial"/>
-              </w:rPr>
-              <w:t>}</w:t>
+              <w:t>{nama_kegiatan}</w:t>
             </w:r>
           </w:p>
         </w:tc>
@@ -421,21 +389,7 @@
               <w:rPr>
                 <w:rFonts w:ascii="Arial" w:hAnsi="Arial" w:cs="Arial"/>
               </w:rPr>
-              <w:t>{</w:t>
-            </w:r>
-            <w:proofErr w:type="spellStart"/>
-            <w:r>
-              <w:rPr>
-                <w:rFonts w:ascii="Arial" w:hAnsi="Arial" w:cs="Arial"/>
-              </w:rPr>
-              <w:t>jenis_dokumen</w:t>
-            </w:r>
-            <w:proofErr w:type="spellEnd"/>
-            <w:r>
-              <w:rPr>
-                <w:rFonts w:ascii="Arial" w:hAnsi="Arial" w:cs="Arial"/>
-              </w:rPr>
-              <w:t>}</w:t>
+              <w:t>{jenis_dokumen}</w:t>
             </w:r>
           </w:p>
         </w:tc>
@@ -452,87 +406,60 @@
                 <w:lang w:val="en-US"/>
               </w:rPr>
             </w:pPr>
-            <w:proofErr w:type="spellStart"/>
             <w:r>
               <w:rPr>
                 <w:rFonts w:ascii="Arial" w:hAnsi="Arial" w:cs="Arial"/>
                 <w:lang w:val="en-US"/>
               </w:rPr>
-              <w:t>Nomor</w:t>
-            </w:r>
-            <w:proofErr w:type="spellEnd"/>
-            <w:r>
+              <w:t>Nomor Registrasi (DLH)</w:t>
+            </w:r>
+          </w:p>
+        </w:tc>
+        <w:tc>
+          <w:tcPr>
+            <w:tcW w:w="284" w:type="dxa"/>
+          </w:tcPr>
+          <w:p>
+            <w:pPr>
+              <w:jc w:val="center"/>
               <w:rPr>
                 <w:rFonts w:ascii="Arial" w:hAnsi="Arial" w:cs="Arial"/>
                 <w:lang w:val="en-US"/>
               </w:rPr>
-              <w:t xml:space="preserve"> </w:t>
-            </w:r>
-            <w:proofErr w:type="spellStart"/>
+            </w:pPr>
             <w:r>
               <w:rPr>
                 <w:rFonts w:ascii="Arial" w:hAnsi="Arial" w:cs="Arial"/>
                 <w:lang w:val="en-US"/>
               </w:rPr>
-              <w:t>Registrasi</w:t>
-            </w:r>
-            <w:proofErr w:type="spellEnd"/>
-            <w:r>
+              <w:t>:</w:t>
+            </w:r>
+          </w:p>
+        </w:tc>
+        <w:tc>
+          <w:tcPr>
+            <w:tcW w:w="6520" w:type="dxa"/>
+          </w:tcPr>
+          <w:p>
+            <w:pPr>
               <w:rPr>
                 <w:rFonts w:ascii="Arial" w:hAnsi="Arial" w:cs="Arial"/>
                 <w:lang w:val="en-US"/>
               </w:rPr>
-              <w:t xml:space="preserve"> (DLH)</w:t>
-            </w:r>
-          </w:p>
-        </w:tc>
-        <w:tc>
-          <w:tcPr>
-            <w:tcW w:w="284" w:type="dxa"/>
-          </w:tcPr>
-          <w:p>
-            <w:pPr>
-              <w:jc w:val="center"/>
+            </w:pPr>
+            <w:r>
               <w:rPr>
                 <w:rFonts w:ascii="Arial" w:hAnsi="Arial" w:cs="Arial"/>
                 <w:lang w:val="en-US"/>
               </w:rPr>
-            </w:pPr>
-            <w:r>
-              <w:rPr>
-                <w:rFonts w:ascii="Arial" w:hAnsi="Arial" w:cs="Arial"/>
-                <w:lang w:val="en-US"/>
-              </w:rPr>
-              <w:t>:</w:t>
-            </w:r>
-          </w:p>
-        </w:tc>
-        <w:tc>
-          <w:tcPr>
-            <w:tcW w:w="6520" w:type="dxa"/>
-          </w:tcPr>
-          <w:p>
-            <w:pPr>
-              <w:rPr>
-                <w:rFonts w:ascii="Arial" w:hAnsi="Arial" w:cs="Arial"/>
-                <w:lang w:val="en-US"/>
-              </w:rPr>
-            </w:pPr>
-            <w:r>
-              <w:rPr>
-                <w:rFonts w:ascii="Arial" w:hAnsi="Arial" w:cs="Arial"/>
-                <w:lang w:val="en-US"/>
-              </w:rPr>
               <w:t>{</w:t>
             </w:r>
-            <w:proofErr w:type="spellStart"/>
             <w:r>
               <w:rPr>
                 <w:rFonts w:ascii="Arial" w:hAnsi="Arial" w:cs="Arial"/>
               </w:rPr>
               <w:t>nomor_checklist</w:t>
             </w:r>
-            <w:proofErr w:type="spellEnd"/>
             <w:r>
               <w:rPr>
                 <w:rFonts w:ascii="Arial" w:hAnsi="Arial" w:cs="Arial"/>
@@ -602,14 +529,12 @@
               </w:rPr>
               <w:t>{</w:t>
             </w:r>
-            <w:proofErr w:type="spellStart"/>
             <w:r>
               <w:rPr>
                 <w:rFonts w:ascii="Arial" w:hAnsi="Arial" w:cs="Arial"/>
               </w:rPr>
               <w:t>tanggal_masuk</w:t>
             </w:r>
-            <w:proofErr w:type="spellEnd"/>
             <w:r>
               <w:rPr>
                 <w:rFonts w:ascii="Arial" w:hAnsi="Arial" w:cs="Arial"/>
@@ -641,12 +566,14 @@
         <w:gridCol w:w="1282"/>
         <w:gridCol w:w="3255"/>
         <w:gridCol w:w="1701"/>
-        <w:gridCol w:w="3402"/>
+        <w:gridCol w:w="1701"/>
+        <w:gridCol w:w="1701"/>
       </w:tblGrid>
       <w:tr>
         <w:tc>
           <w:tcPr>
             <w:tcW w:w="1282" w:type="dxa"/>
+            <w:vAlign w:val="center"/>
           </w:tcPr>
           <w:p>
             <w:pPr>
@@ -657,7 +584,6 @@
                 <w:bCs/>
               </w:rPr>
             </w:pPr>
-            <w:proofErr w:type="spellStart"/>
             <w:r>
               <w:rPr>
                 <w:rFonts w:ascii="Arial" w:hAnsi="Arial" w:cs="Arial"/>
@@ -666,12 +592,12 @@
               </w:rPr>
               <w:t>No</w:t>
             </w:r>
-            <w:proofErr w:type="spellEnd"/>
           </w:p>
         </w:tc>
         <w:tc>
           <w:tcPr>
             <w:tcW w:w="3255" w:type="dxa"/>
+            <w:vAlign w:val="center"/>
           </w:tcPr>
           <w:p>
             <w:pPr>
@@ -695,6 +621,7 @@
         <w:tc>
           <w:tcPr>
             <w:tcW w:w="1701" w:type="dxa"/>
+            <w:vAlign w:val="center"/>
           </w:tcPr>
           <w:p>
             <w:pPr>
@@ -713,28 +640,85 @@
               </w:rPr>
               <w:t>Kelengkapan</w:t>
             </w:r>
-          </w:p>
-        </w:tc>
-        <w:tc>
-          <w:tcPr>
-            <w:tcW w:w="3402" w:type="dxa"/>
-          </w:tcPr>
-          <w:p>
-            <w:pPr>
-              <w:jc w:val="center"/>
+            <w:r>
               <w:rPr>
                 <w:rFonts w:ascii="Arial" w:hAnsi="Arial" w:cs="Arial"/>
                 <w:b/>
                 <w:bCs/>
               </w:rPr>
-            </w:pPr>
-            <w:r>
+              <w:t xml:space="preserve"> PL</w:t>
+            </w:r>
+          </w:p>
+        </w:tc>
+        <w:tc>
+          <w:tcPr>
+            <w:tcW w:w="1701" w:type="dxa"/>
+            <w:vAlign w:val="center"/>
+          </w:tcPr>
+          <w:p>
+            <w:pPr>
+              <w:jc w:val="center"/>
               <w:rPr>
                 <w:rFonts w:ascii="Arial" w:hAnsi="Arial" w:cs="Arial"/>
                 <w:b/>
                 <w:bCs/>
               </w:rPr>
-              <w:t>Keterangan</w:t>
+            </w:pPr>
+            <w:r>
+              <w:rPr>
+                <w:rFonts w:ascii="Arial" w:hAnsi="Arial" w:cs="Arial"/>
+                <w:b/>
+                <w:bCs/>
+              </w:rPr>
+              <w:t>Kelengkapan</w:t>
+            </w:r>
+            <w:r>
+              <w:rPr>
+                <w:rFonts w:ascii="Arial" w:hAnsi="Arial" w:cs="Arial"/>
+                <w:b/>
+                <w:bCs/>
+              </w:rPr>
+              <w:t xml:space="preserve"> </w:t>
+            </w:r>
+            <w:r>
+              <w:rPr>
+                <w:rFonts w:ascii="Arial" w:hAnsi="Arial" w:cs="Arial"/>
+                <w:b/>
+                <w:bCs/>
+              </w:rPr>
+              <w:t>P</w:t>
+            </w:r>
+            <w:r>
+              <w:rPr>
+                <w:rFonts w:ascii="Arial" w:hAnsi="Arial" w:cs="Arial"/>
+                <w:b/>
+                <w:bCs/>
+              </w:rPr>
+              <w:t>ERTEK</w:t>
+            </w:r>
+          </w:p>
+        </w:tc>
+        <w:tc>
+          <w:tcPr>
+            <w:tcW w:w="1701" w:type="dxa"/>
+            <w:vAlign w:val="center"/>
+          </w:tcPr>
+          <w:p>
+            <w:pPr>
+              <w:jc w:val="center"/>
+              <w:rPr>
+                <w:rFonts w:ascii="Arial" w:hAnsi="Arial" w:cs="Arial"/>
+                <w:b/>
+                <w:bCs/>
+              </w:rPr>
+            </w:pPr>
+            <w:r>
+              <w:rPr>
+                <w:rFonts w:ascii="Arial" w:hAnsi="Arial" w:cs="Arial"/>
+                <w:b/>
+                <w:bCs/>
+              </w:rPr>
+              <w:t>Kelengkapan RINTEK</w:t>
             </w:r>
           </w:p>
         </w:tc>
@@ -781,69 +765,186 @@
                 <w:rStyle w:val="HTMLCode"/>
                 <w:rFonts w:ascii="Arial" w:eastAsiaTheme="minorHAnsi" w:hAnsi="Arial" w:cs="Arial"/>
               </w:rPr>
-              <w:t>{</w:t>
-            </w:r>
-            <w:proofErr w:type="spellStart"/>
-            <w:r>
+              <w:t>{item_nama}</w:t>
+            </w:r>
+          </w:p>
+        </w:tc>
+        <w:tc>
+          <w:tcPr>
+            <w:tcW w:w="1701" w:type="dxa"/>
+            <w:vAlign w:val="center"/>
+          </w:tcPr>
+          <w:p>
+            <w:pPr>
+              <w:jc w:val="center"/>
+              <w:rPr>
+                <w:rFonts w:ascii="Arial" w:hAnsi="Arial" w:cs="Arial"/>
+                <w:sz w:val="20"/>
+                <w:szCs w:val="20"/>
+              </w:rPr>
+            </w:pPr>
+            <w:r>
+              <w:rPr>
+                <w:rFonts w:ascii="Arial" w:hAnsi="Arial" w:cs="Arial"/>
+                <w:sz w:val="20"/>
+                <w:szCs w:val="20"/>
+              </w:rPr>
+              <w:t>{ada_pl}</w:t>
+            </w:r>
+          </w:p>
+        </w:tc>
+        <w:tc>
+          <w:tcPr>
+            <w:tcW w:w="1701" w:type="dxa"/>
+            <w:vAlign w:val="center"/>
+          </w:tcPr>
+          <w:p>
+            <w:pPr>
+              <w:jc w:val="center"/>
               <w:rPr>
                 <w:rStyle w:val="HTMLCode"/>
                 <w:rFonts w:ascii="Arial" w:eastAsiaTheme="minorHAnsi" w:hAnsi="Arial" w:cs="Arial"/>
               </w:rPr>
-              <w:t>item_nama</w:t>
-            </w:r>
-            <w:proofErr w:type="spellEnd"/>
-            <w:r>
+            </w:pPr>
+            <w:r>
+              <w:rPr>
+                <w:rFonts w:ascii="Arial" w:hAnsi="Arial" w:cs="Arial"/>
+                <w:sz w:val="20"/>
+                <w:szCs w:val="20"/>
+              </w:rPr>
+              <w:t>{ada_pertek}</w:t>
+            </w:r>
+          </w:p>
+        </w:tc>
+        <w:tc>
+          <w:tcPr>
+            <w:tcW w:w="1701" w:type="dxa"/>
+            <w:vAlign w:val="center"/>
+          </w:tcPr>
+          <w:p>
+            <w:pPr>
+              <w:jc w:val="center"/>
               <w:rPr>
                 <w:rStyle w:val="HTMLCode"/>
                 <w:rFonts w:ascii="Arial" w:eastAsiaTheme="minorHAnsi" w:hAnsi="Arial" w:cs="Arial"/>
               </w:rPr>
-              <w:t>}</w:t>
-            </w:r>
-          </w:p>
-        </w:tc>
-        <w:tc>
-          <w:tcPr>
-            <w:tcW w:w="1701" w:type="dxa"/>
-            <w:vAlign w:val="center"/>
-          </w:tcPr>
-          <w:p>
-            <w:pPr>
-              <w:jc w:val="center"/>
+            </w:pPr>
+            <w:r>
               <w:rPr>
                 <w:rFonts w:ascii="Arial" w:hAnsi="Arial" w:cs="Arial"/>
                 <w:sz w:val="20"/>
                 <w:szCs w:val="20"/>
               </w:rPr>
-            </w:pPr>
+              <w:t>{ada_rintek}</w:t>
+            </w:r>
             <w:r>
               <w:rPr>
                 <w:rStyle w:val="HTMLCode"/>
                 <w:rFonts w:ascii="Arial" w:eastAsiaTheme="minorHAnsi" w:hAnsi="Arial" w:cs="Arial"/>
               </w:rPr>
-              <w:t>{ada}</w:t>
-            </w:r>
-          </w:p>
-        </w:tc>
-        <w:tc>
-          <w:tcPr>
-            <w:tcW w:w="3402" w:type="dxa"/>
-            <w:vAlign w:val="center"/>
-          </w:tcPr>
-          <w:p>
-            <w:pPr>
-              <w:jc w:val="center"/>
-              <w:rPr>
-                <w:rFonts w:ascii="Arial" w:hAnsi="Arial" w:cs="Arial"/>
-                <w:sz w:val="20"/>
-                <w:szCs w:val="20"/>
-              </w:rPr>
-            </w:pPr>
+              <w:t>{</w:t>
+            </w:r>
             <w:r>
               <w:rPr>
                 <w:rStyle w:val="HTMLCode"/>
                 <w:rFonts w:ascii="Arial" w:eastAsiaTheme="minorHAnsi" w:hAnsi="Arial" w:cs="Arial"/>
               </w:rPr>
-              <w:t>{keterangan}{/persyaratan}</w:t>
+              <w:t>/</w:t>
+            </w:r>
+            <w:r>
+              <w:rPr>
+                <w:rStyle w:val="HTMLCode"/>
+                <w:rFonts w:ascii="Arial" w:eastAsiaTheme="minorHAnsi" w:hAnsi="Arial" w:cs="Arial"/>
+              </w:rPr>
+              <w:t>persyaratan}</w:t>
+            </w:r>
+          </w:p>
+        </w:tc>
+      </w:tr>
+    </w:tbl>
+    <w:p>
+      <w:pPr>
+        <w:spacing w:after="0"/>
+        <w:rPr>
+          <w:rFonts w:ascii="Arial" w:hAnsi="Arial" w:cs="Arial"/>
+        </w:rPr>
+      </w:pPr>
+    </w:p>
+    <w:tbl>
+      <w:tblPr>
+        <w:tblStyle w:val="TableGrid"/>
+        <w:tblW w:w="9640" w:type="dxa"/>
+        <w:tblInd w:w="-431" w:type="dxa"/>
+        <w:tblLook w:val="04A0" w:firstRow="1" w:lastRow="0" w:firstColumn="1" w:lastColumn="0" w:noHBand="0" w:noVBand="1"/>
+      </w:tblPr>
+      <w:tblGrid>
+        <w:gridCol w:w="1986"/>
+        <w:gridCol w:w="7654"/>
+      </w:tblGrid>
+      <w:tr>
+        <w:tc>
+          <w:tcPr>
+            <w:tcW w:w="1986" w:type="dxa"/>
+          </w:tcPr>
+          <w:p>
+            <w:pPr>
+              <w:rPr>
+                <w:rFonts w:ascii="Arial" w:hAnsi="Arial" w:cs="Arial"/>
+                <w:b/>
+                <w:bCs/>
+              </w:rPr>
+            </w:pPr>
+            <w:r>
+              <w:rPr>
+                <w:rFonts w:ascii="Arial" w:hAnsi="Arial" w:cs="Arial"/>
+                <w:b/>
+                <w:bCs/>
+              </w:rPr>
+              <w:t>Keterangan</w:t>
+            </w:r>
+          </w:p>
+        </w:tc>
+        <w:tc>
+          <w:tcPr>
+            <w:tcW w:w="7654" w:type="dxa"/>
+          </w:tcPr>
+          <w:p>
+            <w:pPr>
+              <w:rPr>
+                <w:rFonts w:ascii="Arial" w:hAnsi="Arial" w:cs="Arial"/>
+              </w:rPr>
+            </w:pPr>
+            <w:r>
+              <w:rPr>
+                <w:rFonts w:ascii="Arial" w:hAnsi="Arial" w:cs="Arial"/>
+              </w:rPr>
+              <w:t>{#keterangan_otomatis}</w:t>
+            </w:r>
+          </w:p>
+          <w:p>
+            <w:pPr>
+              <w:rPr>
+                <w:rFonts w:ascii="Arial" w:hAnsi="Arial" w:cs="Arial"/>
+              </w:rPr>
+            </w:pPr>
+            <w:r>
+              <w:rPr>
+                <w:rFonts w:ascii="Arial" w:hAnsi="Arial" w:cs="Arial"/>
+              </w:rPr>
+              <w:t>{no}. {teks_keterangan}</w:t>
+            </w:r>
+          </w:p>
+          <w:p>
+            <w:pPr>
+              <w:rPr>
+                <w:rFonts w:ascii="Arial" w:hAnsi="Arial" w:cs="Arial"/>
+              </w:rPr>
+            </w:pPr>
+            <w:r>
+              <w:rPr>
+                <w:rFonts w:ascii="Arial" w:hAnsi="Arial" w:cs="Arial"/>
+              </w:rPr>
+              <w:t>{/keterangan_otomatis}</w:t>
             </w:r>
           </w:p>
         </w:tc>
@@ -945,35 +1046,7 @@
               <w:rPr>
                 <w:rFonts w:ascii="Arial" w:hAnsi="Arial" w:cs="Arial"/>
               </w:rPr>
-              <w:t>{</w:t>
-            </w:r>
-            <w:proofErr w:type="spellStart"/>
-            <w:r>
-              <w:rPr>
-                <w:rFonts w:ascii="Arial" w:hAnsi="Arial" w:cs="Arial"/>
-              </w:rPr>
-              <w:t>nama_pemrakarsa</w:t>
-            </w:r>
-            <w:proofErr w:type="spellEnd"/>
-            <w:r>
-              <w:rPr>
-                <w:rFonts w:ascii="Arial" w:hAnsi="Arial" w:cs="Arial"/>
-              </w:rPr>
-              <w:t>} ({</w:t>
-            </w:r>
-            <w:proofErr w:type="spellStart"/>
-            <w:r>
-              <w:rPr>
-                <w:rFonts w:ascii="Arial" w:hAnsi="Arial" w:cs="Arial"/>
-              </w:rPr>
-              <w:t>telp_pemrakarsa</w:t>
-            </w:r>
-            <w:proofErr w:type="spellEnd"/>
-            <w:r>
-              <w:rPr>
-                <w:rFonts w:ascii="Arial" w:hAnsi="Arial" w:cs="Arial"/>
-              </w:rPr>
-              <w:t>})</w:t>
+              <w:t>{nama_pemrakarsa} ({telp_pemrakarsa})</w:t>
             </w:r>
           </w:p>
         </w:tc>
@@ -1029,35 +1102,7 @@
               <w:rPr>
                 <w:rFonts w:ascii="Arial" w:hAnsi="Arial" w:cs="Arial"/>
               </w:rPr>
-              <w:t>{</w:t>
-            </w:r>
-            <w:proofErr w:type="spellStart"/>
-            <w:r>
-              <w:rPr>
-                <w:rFonts w:ascii="Arial" w:hAnsi="Arial" w:cs="Arial"/>
-              </w:rPr>
-              <w:t>nama_konsultan</w:t>
-            </w:r>
-            <w:proofErr w:type="spellEnd"/>
-            <w:r>
-              <w:rPr>
-                <w:rFonts w:ascii="Arial" w:hAnsi="Arial" w:cs="Arial"/>
-              </w:rPr>
-              <w:t>} ({</w:t>
-            </w:r>
-            <w:proofErr w:type="spellStart"/>
-            <w:r>
-              <w:rPr>
-                <w:rFonts w:ascii="Arial" w:hAnsi="Arial" w:cs="Arial"/>
-              </w:rPr>
-              <w:t>telp_konsultan</w:t>
-            </w:r>
-            <w:proofErr w:type="spellEnd"/>
-            <w:r>
-              <w:rPr>
-                <w:rFonts w:ascii="Arial" w:hAnsi="Arial" w:cs="Arial"/>
-              </w:rPr>
-              <w:t>})</w:t>
+              <w:t>{nama_konsultan} ({telp_konsultan})</w:t>
             </w:r>
           </w:p>
         </w:tc>
@@ -1113,21 +1158,7 @@
               <w:rPr>
                 <w:rFonts w:ascii="Arial" w:hAnsi="Arial" w:cs="Arial"/>
               </w:rPr>
-              <w:t>{</w:t>
-            </w:r>
-            <w:proofErr w:type="spellStart"/>
-            <w:r>
-              <w:rPr>
-                <w:rFonts w:ascii="Arial" w:hAnsi="Arial" w:cs="Arial"/>
-              </w:rPr>
-              <w:t>status_tahapan</w:t>
-            </w:r>
-            <w:proofErr w:type="spellEnd"/>
-            <w:r>
-              <w:rPr>
-                <w:rFonts w:ascii="Arial" w:hAnsi="Arial" w:cs="Arial"/>
-              </w:rPr>
-              <w:t>}</w:t>
+              <w:t>{status_tahapan}</w:t>
             </w:r>
           </w:p>
         </w:tc>
@@ -1296,19 +1327,8 @@
                 <w:sz w:val="16"/>
                 <w:szCs w:val="16"/>
               </w:rPr>
-              <w:t xml:space="preserve">Bubuhkan stempel resmi </w:t>
-            </w:r>
-            <w:proofErr w:type="spellStart"/>
-            <w:r>
-              <w:rPr>
-                <w:rFonts w:ascii="Arial" w:hAnsi="Arial" w:cs="Arial"/>
-                <w:color w:val="BFBFBF" w:themeColor="background1" w:themeShade="BF"/>
-                <w:sz w:val="16"/>
-                <w:szCs w:val="16"/>
-              </w:rPr>
-              <w:t>disini</w:t>
-            </w:r>
-            <w:proofErr w:type="spellEnd"/>
+              <w:t>Bubuhkan stempel resmi disini</w:t>
+            </w:r>
           </w:p>
         </w:tc>
         <w:tc>
@@ -1333,25 +1353,7 @@
                 <w:b/>
                 <w:bCs/>
               </w:rPr>
-              <w:t>({</w:t>
-            </w:r>
-            <w:proofErr w:type="spellStart"/>
-            <w:r>
-              <w:rPr>
-                <w:rFonts w:ascii="Arial" w:hAnsi="Arial" w:cs="Arial"/>
-                <w:b/>
-                <w:bCs/>
-              </w:rPr>
-              <w:t>nama_pengirim</w:t>
-            </w:r>
-            <w:proofErr w:type="spellEnd"/>
-            <w:r>
-              <w:rPr>
-                <w:rFonts w:ascii="Arial" w:hAnsi="Arial" w:cs="Arial"/>
-                <w:b/>
-                <w:bCs/>
-              </w:rPr>
-              <w:t>})</w:t>
+              <w:t>({nama_pengirim})</w:t>
             </w:r>
           </w:p>
         </w:tc>
@@ -1377,25 +1379,7 @@
                 <w:b/>
                 <w:bCs/>
               </w:rPr>
-              <w:t>({</w:t>
-            </w:r>
-            <w:proofErr w:type="spellStart"/>
-            <w:r>
-              <w:rPr>
-                <w:rFonts w:ascii="Arial" w:hAnsi="Arial" w:cs="Arial"/>
-                <w:b/>
-                <w:bCs/>
-              </w:rPr>
-              <w:t>petugas_penerima</w:t>
-            </w:r>
-            <w:proofErr w:type="spellEnd"/>
-            <w:r>
-              <w:rPr>
-                <w:rFonts w:ascii="Arial" w:hAnsi="Arial" w:cs="Arial"/>
-                <w:b/>
-                <w:bCs/>
-              </w:rPr>
-              <w:t>})</w:t>
+              <w:t>({petugas_penerima})</w:t>
             </w:r>
           </w:p>
         </w:tc>
@@ -2156,7 +2140,6 @@
   <w:style w:type="character" w:default="1" w:styleId="DefaultParagraphFont">
     <w:name w:val="Default Paragraph Font"/>
     <w:uiPriority w:val="1"/>
-    <w:semiHidden/>
     <w:unhideWhenUsed/>
   </w:style>
   <w:style w:type="table" w:default="1" w:styleId="TableNormal">

</xml_diff>

<commit_message>
chore: update template_checklist.docx as requested by user
</commit_message>
<xml_diff>
--- a/src/templates/registrasi/template_checklist.docx
+++ b/src/templates/registrasi/template_checklist.docx
@@ -195,7 +195,25 @@
                 <w:sz w:val="20"/>
                 <w:szCs w:val="20"/>
               </w:rPr>
-              <w:t>Telepon (0271) 891136, Faksimile (0271) 891136, Laman www.dlh.sragenkab.go.id, Pos-el dlh.sragenkab.go.id</w:t>
+              <w:t>Telepon (0271) 891136, Faksimile (0271) 891136, Laman www.dlh.sragenkab.go.id, Pos-</w:t>
+            </w:r>
+            <w:proofErr w:type="spellStart"/>
+            <w:r>
+              <w:rPr>
+                <w:rFonts w:ascii="Arial Narrow" w:hAnsi="Arial Narrow" w:cs="Arial"/>
+                <w:sz w:val="20"/>
+                <w:szCs w:val="20"/>
+              </w:rPr>
+              <w:t>el</w:t>
+            </w:r>
+            <w:proofErr w:type="spellEnd"/>
+            <w:r>
+              <w:rPr>
+                <w:rFonts w:ascii="Arial Narrow" w:hAnsi="Arial Narrow" w:cs="Arial"/>
+                <w:sz w:val="20"/>
+                <w:szCs w:val="20"/>
+              </w:rPr>
+              <w:t xml:space="preserve"> dlh.sragenkab.go.id</w:t>
             </w:r>
           </w:p>
         </w:tc>
@@ -328,7 +346,21 @@
               <w:rPr>
                 <w:rFonts w:ascii="Arial" w:hAnsi="Arial" w:cs="Arial"/>
               </w:rPr>
-              <w:t>{nama_kegiatan}</w:t>
+              <w:t>{</w:t>
+            </w:r>
+            <w:proofErr w:type="spellStart"/>
+            <w:r>
+              <w:rPr>
+                <w:rFonts w:ascii="Arial" w:hAnsi="Arial" w:cs="Arial"/>
+              </w:rPr>
+              <w:t>nama_kegiatan</w:t>
+            </w:r>
+            <w:proofErr w:type="spellEnd"/>
+            <w:r>
+              <w:rPr>
+                <w:rFonts w:ascii="Arial" w:hAnsi="Arial" w:cs="Arial"/>
+              </w:rPr>
+              <w:t>}</w:t>
             </w:r>
           </w:p>
         </w:tc>
@@ -389,7 +421,21 @@
               <w:rPr>
                 <w:rFonts w:ascii="Arial" w:hAnsi="Arial" w:cs="Arial"/>
               </w:rPr>
-              <w:t>{jenis_dokumen}</w:t>
+              <w:t>{</w:t>
+            </w:r>
+            <w:proofErr w:type="spellStart"/>
+            <w:r>
+              <w:rPr>
+                <w:rFonts w:ascii="Arial" w:hAnsi="Arial" w:cs="Arial"/>
+              </w:rPr>
+              <w:t>jenis_dokumen</w:t>
+            </w:r>
+            <w:proofErr w:type="spellEnd"/>
+            <w:r>
+              <w:rPr>
+                <w:rFonts w:ascii="Arial" w:hAnsi="Arial" w:cs="Arial"/>
+              </w:rPr>
+              <w:t>}</w:t>
             </w:r>
           </w:p>
         </w:tc>
@@ -406,12 +452,37 @@
                 <w:lang w:val="en-US"/>
               </w:rPr>
             </w:pPr>
+            <w:proofErr w:type="spellStart"/>
             <w:r>
               <w:rPr>
                 <w:rFonts w:ascii="Arial" w:hAnsi="Arial" w:cs="Arial"/>
                 <w:lang w:val="en-US"/>
               </w:rPr>
-              <w:t>Nomor Registrasi (DLH)</w:t>
+              <w:t>Nomor</w:t>
+            </w:r>
+            <w:proofErr w:type="spellEnd"/>
+            <w:r>
+              <w:rPr>
+                <w:rFonts w:ascii="Arial" w:hAnsi="Arial" w:cs="Arial"/>
+                <w:lang w:val="en-US"/>
+              </w:rPr>
+              <w:t xml:space="preserve"> </w:t>
+            </w:r>
+            <w:proofErr w:type="spellStart"/>
+            <w:r>
+              <w:rPr>
+                <w:rFonts w:ascii="Arial" w:hAnsi="Arial" w:cs="Arial"/>
+                <w:lang w:val="en-US"/>
+              </w:rPr>
+              <w:t>Registrasi</w:t>
+            </w:r>
+            <w:proofErr w:type="spellEnd"/>
+            <w:r>
+              <w:rPr>
+                <w:rFonts w:ascii="Arial" w:hAnsi="Arial" w:cs="Arial"/>
+                <w:lang w:val="en-US"/>
+              </w:rPr>
+              <w:t xml:space="preserve"> (DLH)</w:t>
             </w:r>
           </w:p>
         </w:tc>
@@ -454,12 +525,14 @@
               </w:rPr>
               <w:t>{</w:t>
             </w:r>
+            <w:proofErr w:type="spellStart"/>
             <w:r>
               <w:rPr>
                 <w:rFonts w:ascii="Arial" w:hAnsi="Arial" w:cs="Arial"/>
               </w:rPr>
               <w:t>nomor_checklist</w:t>
             </w:r>
+            <w:proofErr w:type="spellEnd"/>
             <w:r>
               <w:rPr>
                 <w:rFonts w:ascii="Arial" w:hAnsi="Arial" w:cs="Arial"/>
@@ -529,12 +602,14 @@
               </w:rPr>
               <w:t>{</w:t>
             </w:r>
+            <w:proofErr w:type="spellStart"/>
             <w:r>
               <w:rPr>
                 <w:rFonts w:ascii="Arial" w:hAnsi="Arial" w:cs="Arial"/>
               </w:rPr>
               <w:t>tanggal_masuk</w:t>
             </w:r>
+            <w:proofErr w:type="spellEnd"/>
             <w:r>
               <w:rPr>
                 <w:rFonts w:ascii="Arial" w:hAnsi="Arial" w:cs="Arial"/>
@@ -584,6 +659,7 @@
                 <w:bCs/>
               </w:rPr>
             </w:pPr>
+            <w:proofErr w:type="spellStart"/>
             <w:r>
               <w:rPr>
                 <w:rFonts w:ascii="Arial" w:hAnsi="Arial" w:cs="Arial"/>
@@ -592,6 +668,7 @@
               </w:rPr>
               <w:t>No</w:t>
             </w:r>
+            <w:proofErr w:type="spellEnd"/>
           </w:p>
         </w:tc>
         <w:tc>
@@ -678,7 +755,7 @@
                 <w:b/>
                 <w:bCs/>
               </w:rPr>
-              <w:t xml:space="preserve"> </w:t>
+              <w:t xml:space="preserve"> P</w:t>
             </w:r>
             <w:r>
               <w:rPr>
@@ -686,15 +763,94 @@
                 <w:b/>
                 <w:bCs/>
               </w:rPr>
-              <w:t>P</w:t>
-            </w:r>
-            <w:r>
+              <w:t>ERTEK</w:t>
+            </w:r>
+          </w:p>
+        </w:tc>
+        <w:tc>
+          <w:tcPr>
+            <w:tcW w:w="1701" w:type="dxa"/>
+            <w:vAlign w:val="center"/>
+          </w:tcPr>
+          <w:p>
+            <w:pPr>
+              <w:jc w:val="center"/>
               <w:rPr>
                 <w:rFonts w:ascii="Arial" w:hAnsi="Arial" w:cs="Arial"/>
                 <w:b/>
                 <w:bCs/>
               </w:rPr>
-              <w:t>ERTEK</w:t>
+            </w:pPr>
+            <w:r>
+              <w:rPr>
+                <w:rFonts w:ascii="Arial" w:hAnsi="Arial" w:cs="Arial"/>
+                <w:b/>
+                <w:bCs/>
+              </w:rPr>
+              <w:t>Kelengkapan RINTEK</w:t>
+            </w:r>
+          </w:p>
+        </w:tc>
+      </w:tr>
+      <w:tr>
+        <w:tc>
+          <w:tcPr>
+            <w:tcW w:w="1282" w:type="dxa"/>
+            <w:vAlign w:val="center"/>
+          </w:tcPr>
+          <w:p>
+            <w:pPr>
+              <w:jc w:val="center"/>
+              <w:rPr>
+                <w:rFonts w:ascii="Arial" w:hAnsi="Arial" w:cs="Arial"/>
+                <w:sz w:val="20"/>
+                <w:szCs w:val="20"/>
+              </w:rPr>
+            </w:pPr>
+            <w:r>
+              <w:rPr>
+                <w:rStyle w:val="HTMLCode"/>
+                <w:rFonts w:ascii="Arial" w:eastAsiaTheme="minorHAnsi" w:hAnsi="Arial" w:cs="Arial"/>
+              </w:rPr>
+              <w:t>{#persyaratan}{no}</w:t>
+            </w:r>
+          </w:p>
+        </w:tc>
+        <w:tc>
+          <w:tcPr>
+            <w:tcW w:w="3255" w:type="dxa"/>
+            <w:vAlign w:val="center"/>
+          </w:tcPr>
+          <w:p>
+            <w:pPr>
+              <w:rPr>
+                <w:rFonts w:ascii="Arial" w:hAnsi="Arial" w:cs="Arial"/>
+                <w:sz w:val="20"/>
+                <w:szCs w:val="20"/>
+              </w:rPr>
+            </w:pPr>
+            <w:r>
+              <w:rPr>
+                <w:rStyle w:val="HTMLCode"/>
+                <w:rFonts w:ascii="Arial" w:eastAsiaTheme="minorHAnsi" w:hAnsi="Arial" w:cs="Arial"/>
+              </w:rPr>
+              <w:t>{</w:t>
+            </w:r>
+            <w:proofErr w:type="spellStart"/>
+            <w:r>
+              <w:rPr>
+                <w:rStyle w:val="HTMLCode"/>
+                <w:rFonts w:ascii="Arial" w:eastAsiaTheme="minorHAnsi" w:hAnsi="Arial" w:cs="Arial"/>
+              </w:rPr>
+              <w:t>item_nama</w:t>
+            </w:r>
+            <w:proofErr w:type="spellEnd"/>
+            <w:r>
+              <w:rPr>
+                <w:rStyle w:val="HTMLCode"/>
+                <w:rFonts w:ascii="Arial" w:eastAsiaTheme="minorHAnsi" w:hAnsi="Arial" w:cs="Arial"/>
+              </w:rPr>
+              <w:t>}</w:t>
             </w:r>
           </w:p>
         </w:tc>
@@ -708,160 +864,164 @@
               <w:jc w:val="center"/>
               <w:rPr>
                 <w:rFonts w:ascii="Arial" w:hAnsi="Arial" w:cs="Arial"/>
-                <w:b/>
-                <w:bCs/>
-              </w:rPr>
-            </w:pPr>
-            <w:r>
-              <w:rPr>
-                <w:rFonts w:ascii="Arial" w:hAnsi="Arial" w:cs="Arial"/>
-                <w:b/>
-                <w:bCs/>
-              </w:rPr>
-              <w:t>Kelengkapan RINTEK</w:t>
-            </w:r>
-          </w:p>
-        </w:tc>
-      </w:tr>
-      <w:tr>
-        <w:tc>
-          <w:tcPr>
-            <w:tcW w:w="1282" w:type="dxa"/>
-            <w:vAlign w:val="center"/>
-          </w:tcPr>
-          <w:p>
-            <w:pPr>
-              <w:jc w:val="center"/>
-              <w:rPr>
-                <w:rFonts w:ascii="Arial" w:hAnsi="Arial" w:cs="Arial"/>
                 <w:sz w:val="20"/>
                 <w:szCs w:val="20"/>
               </w:rPr>
             </w:pPr>
             <w:r>
               <w:rPr>
+                <w:rFonts w:ascii="Arial" w:hAnsi="Arial" w:cs="Arial"/>
+                <w:sz w:val="20"/>
+                <w:szCs w:val="20"/>
+              </w:rPr>
+              <w:t>{</w:t>
+            </w:r>
+            <w:proofErr w:type="spellStart"/>
+            <w:r>
+              <w:rPr>
+                <w:rFonts w:ascii="Arial" w:hAnsi="Arial" w:cs="Arial"/>
+                <w:sz w:val="20"/>
+                <w:szCs w:val="20"/>
+              </w:rPr>
+              <w:t>ada_pl</w:t>
+            </w:r>
+            <w:proofErr w:type="spellEnd"/>
+            <w:r>
+              <w:rPr>
+                <w:rFonts w:ascii="Arial" w:hAnsi="Arial" w:cs="Arial"/>
+                <w:sz w:val="20"/>
+                <w:szCs w:val="20"/>
+              </w:rPr>
+              <w:t>}</w:t>
+            </w:r>
+          </w:p>
+        </w:tc>
+        <w:tc>
+          <w:tcPr>
+            <w:tcW w:w="1701" w:type="dxa"/>
+            <w:vAlign w:val="center"/>
+          </w:tcPr>
+          <w:p>
+            <w:pPr>
+              <w:jc w:val="center"/>
+              <w:rPr>
                 <w:rStyle w:val="HTMLCode"/>
                 <w:rFonts w:ascii="Arial" w:eastAsiaTheme="minorHAnsi" w:hAnsi="Arial" w:cs="Arial"/>
               </w:rPr>
-              <w:t>{#persyaratan}{no}</w:t>
-            </w:r>
-          </w:p>
-        </w:tc>
-        <w:tc>
-          <w:tcPr>
-            <w:tcW w:w="3255" w:type="dxa"/>
-            <w:vAlign w:val="center"/>
-          </w:tcPr>
-          <w:p>
-            <w:pPr>
+            </w:pPr>
+            <w:r>
               <w:rPr>
                 <w:rFonts w:ascii="Arial" w:hAnsi="Arial" w:cs="Arial"/>
                 <w:sz w:val="20"/>
                 <w:szCs w:val="20"/>
               </w:rPr>
-            </w:pPr>
-            <w:r>
+              <w:t>{</w:t>
+            </w:r>
+            <w:proofErr w:type="spellStart"/>
+            <w:r>
+              <w:rPr>
+                <w:rFonts w:ascii="Arial" w:hAnsi="Arial" w:cs="Arial"/>
+                <w:sz w:val="20"/>
+                <w:szCs w:val="20"/>
+              </w:rPr>
+              <w:t>ada_pertek</w:t>
+            </w:r>
+            <w:proofErr w:type="spellEnd"/>
+            <w:r>
+              <w:rPr>
+                <w:rFonts w:ascii="Arial" w:hAnsi="Arial" w:cs="Arial"/>
+                <w:sz w:val="20"/>
+                <w:szCs w:val="20"/>
+              </w:rPr>
+              <w:t>}</w:t>
+            </w:r>
+          </w:p>
+        </w:tc>
+        <w:tc>
+          <w:tcPr>
+            <w:tcW w:w="1701" w:type="dxa"/>
+            <w:vAlign w:val="center"/>
+          </w:tcPr>
+          <w:p>
+            <w:pPr>
+              <w:jc w:val="center"/>
               <w:rPr>
                 <w:rStyle w:val="HTMLCode"/>
                 <w:rFonts w:ascii="Arial" w:eastAsiaTheme="minorHAnsi" w:hAnsi="Arial" w:cs="Arial"/>
               </w:rPr>
-              <w:t>{item_nama}</w:t>
-            </w:r>
-          </w:p>
-        </w:tc>
-        <w:tc>
-          <w:tcPr>
-            <w:tcW w:w="1701" w:type="dxa"/>
-            <w:vAlign w:val="center"/>
-          </w:tcPr>
-          <w:p>
-            <w:pPr>
-              <w:jc w:val="center"/>
+            </w:pPr>
+            <w:r>
               <w:rPr>
                 <w:rFonts w:ascii="Arial" w:hAnsi="Arial" w:cs="Arial"/>
                 <w:sz w:val="20"/>
                 <w:szCs w:val="20"/>
               </w:rPr>
-            </w:pPr>
+              <w:t>{</w:t>
+            </w:r>
+            <w:proofErr w:type="spellStart"/>
             <w:r>
               <w:rPr>
                 <w:rFonts w:ascii="Arial" w:hAnsi="Arial" w:cs="Arial"/>
                 <w:sz w:val="20"/>
                 <w:szCs w:val="20"/>
               </w:rPr>
-              <w:t>{ada_pl}</w:t>
-            </w:r>
-          </w:p>
-        </w:tc>
-        <w:tc>
-          <w:tcPr>
-            <w:tcW w:w="1701" w:type="dxa"/>
-            <w:vAlign w:val="center"/>
-          </w:tcPr>
-          <w:p>
-            <w:pPr>
-              <w:jc w:val="center"/>
+              <w:t>ada_rintek</w:t>
+            </w:r>
+            <w:proofErr w:type="spellEnd"/>
+            <w:r>
+              <w:rPr>
+                <w:rFonts w:ascii="Arial" w:hAnsi="Arial" w:cs="Arial"/>
+                <w:sz w:val="20"/>
+                <w:szCs w:val="20"/>
+              </w:rPr>
+              <w:t>}</w:t>
+            </w:r>
+            <w:r>
               <w:rPr>
                 <w:rStyle w:val="HTMLCode"/>
                 <w:rFonts w:ascii="Arial" w:eastAsiaTheme="minorHAnsi" w:hAnsi="Arial" w:cs="Arial"/>
               </w:rPr>
-            </w:pPr>
-            <w:r>
-              <w:rPr>
-                <w:rFonts w:ascii="Arial" w:hAnsi="Arial" w:cs="Arial"/>
-                <w:sz w:val="20"/>
-                <w:szCs w:val="20"/>
-              </w:rPr>
-              <w:t>{ada_pertek}</w:t>
-            </w:r>
-          </w:p>
-        </w:tc>
-        <w:tc>
-          <w:tcPr>
-            <w:tcW w:w="1701" w:type="dxa"/>
-            <w:vAlign w:val="center"/>
-          </w:tcPr>
-          <w:p>
-            <w:pPr>
-              <w:jc w:val="center"/>
+              <w:t>{</w:t>
+            </w:r>
+            <w:r>
               <w:rPr>
                 <w:rStyle w:val="HTMLCode"/>
                 <w:rFonts w:ascii="Arial" w:eastAsiaTheme="minorHAnsi" w:hAnsi="Arial" w:cs="Arial"/>
               </w:rPr>
-            </w:pPr>
-            <w:r>
-              <w:rPr>
-                <w:rFonts w:ascii="Arial" w:hAnsi="Arial" w:cs="Arial"/>
-                <w:sz w:val="20"/>
-                <w:szCs w:val="20"/>
-              </w:rPr>
-              <w:t>{ada_rintek}</w:t>
+              <w:t>/</w:t>
             </w:r>
             <w:r>
               <w:rPr>
                 <w:rStyle w:val="HTMLCode"/>
                 <w:rFonts w:ascii="Arial" w:eastAsiaTheme="minorHAnsi" w:hAnsi="Arial" w:cs="Arial"/>
               </w:rPr>
-              <w:t>{</w:t>
-            </w:r>
-            <w:r>
-              <w:rPr>
-                <w:rStyle w:val="HTMLCode"/>
-                <w:rFonts w:ascii="Arial" w:eastAsiaTheme="minorHAnsi" w:hAnsi="Arial" w:cs="Arial"/>
-              </w:rPr>
-              <w:t>/</w:t>
-            </w:r>
-            <w:r>
-              <w:rPr>
-                <w:rStyle w:val="HTMLCode"/>
-                <w:rFonts w:ascii="Arial" w:eastAsiaTheme="minorHAnsi" w:hAnsi="Arial" w:cs="Arial"/>
-              </w:rPr>
               <w:t>persyaratan}</w:t>
             </w:r>
           </w:p>
         </w:tc>
       </w:tr>
     </w:tbl>
+    <w:p>
+      <w:pPr>
+        <w:spacing w:after="0"/>
+        <w:rPr>
+          <w:rFonts w:ascii="Arial" w:hAnsi="Arial" w:cs="Arial"/>
+        </w:rPr>
+      </w:pPr>
+    </w:p>
+    <w:p>
+      <w:pPr>
+        <w:rPr>
+          <w:rFonts w:ascii="Arial" w:hAnsi="Arial" w:cs="Arial"/>
+        </w:rPr>
+      </w:pPr>
+      <w:r>
+        <w:rPr>
+          <w:rFonts w:ascii="Arial" w:hAnsi="Arial" w:cs="Arial"/>
+        </w:rPr>
+        <w:br w:type="page"/>
+      </w:r>
+    </w:p>
     <w:p>
       <w:pPr>
         <w:spacing w:after="0"/>
@@ -931,20 +1091,62 @@
               <w:rPr>
                 <w:rFonts w:ascii="Arial" w:hAnsi="Arial" w:cs="Arial"/>
               </w:rPr>
-              <w:t>{no}. {teks_keterangan}</w:t>
-            </w:r>
-          </w:p>
-          <w:p>
-            <w:pPr>
-              <w:rPr>
-                <w:rFonts w:ascii="Arial" w:hAnsi="Arial" w:cs="Arial"/>
-              </w:rPr>
-            </w:pPr>
-            <w:r>
-              <w:rPr>
-                <w:rFonts w:ascii="Arial" w:hAnsi="Arial" w:cs="Arial"/>
-              </w:rPr>
-              <w:t>{/keterangan_otomatis}</w:t>
+              <w:t>{</w:t>
+            </w:r>
+            <w:proofErr w:type="spellStart"/>
+            <w:r>
+              <w:rPr>
+                <w:rFonts w:ascii="Arial" w:hAnsi="Arial" w:cs="Arial"/>
+              </w:rPr>
+              <w:t>no</w:t>
+            </w:r>
+            <w:proofErr w:type="spellEnd"/>
+            <w:r>
+              <w:rPr>
+                <w:rFonts w:ascii="Arial" w:hAnsi="Arial" w:cs="Arial"/>
+              </w:rPr>
+              <w:t>}. {</w:t>
+            </w:r>
+            <w:proofErr w:type="spellStart"/>
+            <w:r>
+              <w:rPr>
+                <w:rFonts w:ascii="Arial" w:hAnsi="Arial" w:cs="Arial"/>
+              </w:rPr>
+              <w:t>teks_keterangan</w:t>
+            </w:r>
+            <w:proofErr w:type="spellEnd"/>
+            <w:r>
+              <w:rPr>
+                <w:rFonts w:ascii="Arial" w:hAnsi="Arial" w:cs="Arial"/>
+              </w:rPr>
+              <w:t>}</w:t>
+            </w:r>
+          </w:p>
+          <w:p>
+            <w:pPr>
+              <w:rPr>
+                <w:rFonts w:ascii="Arial" w:hAnsi="Arial" w:cs="Arial"/>
+              </w:rPr>
+            </w:pPr>
+            <w:r>
+              <w:rPr>
+                <w:rFonts w:ascii="Arial" w:hAnsi="Arial" w:cs="Arial"/>
+              </w:rPr>
+              <w:t>{/</w:t>
+            </w:r>
+            <w:proofErr w:type="spellStart"/>
+            <w:r>
+              <w:rPr>
+                <w:rFonts w:ascii="Arial" w:hAnsi="Arial" w:cs="Arial"/>
+              </w:rPr>
+              <w:t>keterangan_otomatis</w:t>
+            </w:r>
+            <w:proofErr w:type="spellEnd"/>
+            <w:r>
+              <w:rPr>
+                <w:rFonts w:ascii="Arial" w:hAnsi="Arial" w:cs="Arial"/>
+              </w:rPr>
+              <w:t>}</w:t>
             </w:r>
           </w:p>
         </w:tc>
@@ -1046,7 +1248,35 @@
               <w:rPr>
                 <w:rFonts w:ascii="Arial" w:hAnsi="Arial" w:cs="Arial"/>
               </w:rPr>
-              <w:t>{nama_pemrakarsa} ({telp_pemrakarsa})</w:t>
+              <w:t>{</w:t>
+            </w:r>
+            <w:proofErr w:type="spellStart"/>
+            <w:r>
+              <w:rPr>
+                <w:rFonts w:ascii="Arial" w:hAnsi="Arial" w:cs="Arial"/>
+              </w:rPr>
+              <w:t>nama_pemrakarsa</w:t>
+            </w:r>
+            <w:proofErr w:type="spellEnd"/>
+            <w:r>
+              <w:rPr>
+                <w:rFonts w:ascii="Arial" w:hAnsi="Arial" w:cs="Arial"/>
+              </w:rPr>
+              <w:t>} ({</w:t>
+            </w:r>
+            <w:proofErr w:type="spellStart"/>
+            <w:r>
+              <w:rPr>
+                <w:rFonts w:ascii="Arial" w:hAnsi="Arial" w:cs="Arial"/>
+              </w:rPr>
+              <w:t>telp_pemrakarsa</w:t>
+            </w:r>
+            <w:proofErr w:type="spellEnd"/>
+            <w:r>
+              <w:rPr>
+                <w:rFonts w:ascii="Arial" w:hAnsi="Arial" w:cs="Arial"/>
+              </w:rPr>
+              <w:t>})</w:t>
             </w:r>
           </w:p>
         </w:tc>
@@ -1102,7 +1332,35 @@
               <w:rPr>
                 <w:rFonts w:ascii="Arial" w:hAnsi="Arial" w:cs="Arial"/>
               </w:rPr>
-              <w:t>{nama_konsultan} ({telp_konsultan})</w:t>
+              <w:t>{</w:t>
+            </w:r>
+            <w:proofErr w:type="spellStart"/>
+            <w:r>
+              <w:rPr>
+                <w:rFonts w:ascii="Arial" w:hAnsi="Arial" w:cs="Arial"/>
+              </w:rPr>
+              <w:t>nama_konsultan</w:t>
+            </w:r>
+            <w:proofErr w:type="spellEnd"/>
+            <w:r>
+              <w:rPr>
+                <w:rFonts w:ascii="Arial" w:hAnsi="Arial" w:cs="Arial"/>
+              </w:rPr>
+              <w:t>} ({</w:t>
+            </w:r>
+            <w:proofErr w:type="spellStart"/>
+            <w:r>
+              <w:rPr>
+                <w:rFonts w:ascii="Arial" w:hAnsi="Arial" w:cs="Arial"/>
+              </w:rPr>
+              <w:t>telp_konsultan</w:t>
+            </w:r>
+            <w:proofErr w:type="spellEnd"/>
+            <w:r>
+              <w:rPr>
+                <w:rFonts w:ascii="Arial" w:hAnsi="Arial" w:cs="Arial"/>
+              </w:rPr>
+              <w:t>})</w:t>
             </w:r>
           </w:p>
         </w:tc>
@@ -1158,7 +1416,21 @@
               <w:rPr>
                 <w:rFonts w:ascii="Arial" w:hAnsi="Arial" w:cs="Arial"/>
               </w:rPr>
-              <w:t>{status_tahapan}</w:t>
+              <w:t>{</w:t>
+            </w:r>
+            <w:proofErr w:type="spellStart"/>
+            <w:r>
+              <w:rPr>
+                <w:rFonts w:ascii="Arial" w:hAnsi="Arial" w:cs="Arial"/>
+              </w:rPr>
+              <w:t>status_tahapan</w:t>
+            </w:r>
+            <w:proofErr w:type="spellEnd"/>
+            <w:r>
+              <w:rPr>
+                <w:rFonts w:ascii="Arial" w:hAnsi="Arial" w:cs="Arial"/>
+              </w:rPr>
+              <w:t>}</w:t>
             </w:r>
           </w:p>
         </w:tc>
@@ -1327,8 +1599,19 @@
                 <w:sz w:val="16"/>
                 <w:szCs w:val="16"/>
               </w:rPr>
-              <w:t>Bubuhkan stempel resmi disini</w:t>
-            </w:r>
+              <w:t xml:space="preserve">Bubuhkan stempel resmi </w:t>
+            </w:r>
+            <w:proofErr w:type="spellStart"/>
+            <w:r>
+              <w:rPr>
+                <w:rFonts w:ascii="Arial" w:hAnsi="Arial" w:cs="Arial"/>
+                <w:color w:val="BFBFBF" w:themeColor="background1" w:themeShade="BF"/>
+                <w:sz w:val="16"/>
+                <w:szCs w:val="16"/>
+              </w:rPr>
+              <w:t>disini</w:t>
+            </w:r>
+            <w:proofErr w:type="spellEnd"/>
           </w:p>
         </w:tc>
         <w:tc>
@@ -1353,7 +1636,25 @@
                 <w:b/>
                 <w:bCs/>
               </w:rPr>
-              <w:t>({nama_pengirim})</w:t>
+              <w:t>({</w:t>
+            </w:r>
+            <w:proofErr w:type="spellStart"/>
+            <w:r>
+              <w:rPr>
+                <w:rFonts w:ascii="Arial" w:hAnsi="Arial" w:cs="Arial"/>
+                <w:b/>
+                <w:bCs/>
+              </w:rPr>
+              <w:t>nama_pengirim</w:t>
+            </w:r>
+            <w:proofErr w:type="spellEnd"/>
+            <w:r>
+              <w:rPr>
+                <w:rFonts w:ascii="Arial" w:hAnsi="Arial" w:cs="Arial"/>
+                <w:b/>
+                <w:bCs/>
+              </w:rPr>
+              <w:t>})</w:t>
             </w:r>
           </w:p>
         </w:tc>
@@ -1379,7 +1680,25 @@
                 <w:b/>
                 <w:bCs/>
               </w:rPr>
-              <w:t>({petugas_penerima})</w:t>
+              <w:t>({</w:t>
+            </w:r>
+            <w:proofErr w:type="spellStart"/>
+            <w:r>
+              <w:rPr>
+                <w:rFonts w:ascii="Arial" w:hAnsi="Arial" w:cs="Arial"/>
+                <w:b/>
+                <w:bCs/>
+              </w:rPr>
+              <w:t>petugas_penerima</w:t>
+            </w:r>
+            <w:proofErr w:type="spellEnd"/>
+            <w:r>
+              <w:rPr>
+                <w:rFonts w:ascii="Arial" w:hAnsi="Arial" w:cs="Arial"/>
+                <w:b/>
+                <w:bCs/>
+              </w:rPr>
+              <w:t>})</w:t>
             </w:r>
           </w:p>
         </w:tc>
@@ -2140,6 +2459,7 @@
   <w:style w:type="character" w:default="1" w:styleId="DefaultParagraphFont">
     <w:name w:val="Default Paragraph Font"/>
     <w:uiPriority w:val="1"/>
+    <w:semiHidden/>
     <w:unhideWhenUsed/>
   </w:style>
   <w:style w:type="table" w:default="1" w:styleId="TableNormal">

</xml_diff>